<commit_message>
Fix MANUALE_OPERATORE: indice pre-popolato con link cliccabili
</commit_message>
<xml_diff>
--- a/MANUALE_OPERATORE.docx
+++ b/MANUALE_OPERATORE.docx
@@ -94,6 +94,7 @@
         <w:pStyle w:val="Heading1"/>
         <w:spacing w:before="240" w:after="160"/>
       </w:pPr>
+      <w:bookmarkStart w:id="0" w:name="_sec_indice"/>
       <w:r>
         <w:rPr>
           <w:rFonts w:ascii="Arial" w:hAnsi="Arial"/>
@@ -102,6 +103,7 @@
         </w:rPr>
         <w:t>Indice</w:t>
       </w:r>
+      <w:bookmarkEnd w:id="0"/>
     </w:p>
     <w:p>
       <w:r>
@@ -110,7 +112,7 @@
           <w:b w:val="0"/>
           <w:sz w:val="22"/>
         </w:rPr>
-        <w:t>L'indice qui sotto è cliccabile in Word: tieni premuto Ctrl (Windows) o Cmd (Mac) e clicca un titolo per saltare alla sezione.</w:t>
+        <w:t>Tieni premuto Ctrl (Windows) o Cmd (Mac) e clicca un titolo per saltare alla sezione.</w:t>
       </w:r>
     </w:p>
     <w:p>
@@ -123,13 +125,847 @@
       </w:r>
     </w:p>
     <w:p>
-      <w:r>
-        <w:fldChar w:fldCharType="begin"/>
-        <w:instrText xml:space="preserve">TOC \o "1-2" \h \z \u</w:instrText>
-        <w:fldChar w:fldCharType="separate"/>
-        <w:t>Aggiorna l'indice in Word: tasto destro sull'indice → Aggiorna campo. Oppure premi F9.</w:t>
-        <w:fldChar w:fldCharType="end"/>
-      </w:r>
+      <w:pPr>
+        <w:tabs>
+          <w:tab w:pos="8787" w:val="right" w:leader="dot"/>
+        </w:tabs>
+        <w:spacing w:before="40" w:after="40"/>
+      </w:pPr>
+      <w:hyperlink w:anchor="_sec_1_cos_e_il_configuratore_listi">
+        <w:r>
+          <w:rPr>
+            <w:rFonts w:ascii="Arial" w:hAnsi="Arial"/>
+            <w:sz w:val="24"/>
+            <w:b/>
+            <w:color w:val="0563C1"/>
+            <w:u w:val="single"/>
+          </w:rPr>
+          <w:t xml:space="preserve">1. Cos'è il Configuratore Listino</w:t>
+        </w:r>
+        <w:r>
+          <w:rPr>
+            <w:rFonts w:ascii="Arial" w:hAnsi="Arial"/>
+            <w:sz w:val="24"/>
+            <w:color w:val="0563C1"/>
+            <w:u w:val="single"/>
+          </w:rPr>
+          <w:tab/>
+        </w:r>
+        <w:r>
+          <w:rPr>
+            <w:rFonts w:ascii="Arial" w:hAnsi="Arial"/>
+            <w:sz w:val="24"/>
+            <w:b/>
+            <w:color w:val="0563C1"/>
+            <w:u w:val="single"/>
+          </w:rPr>
+          <w:t xml:space="preserve">3</w:t>
+        </w:r>
+      </w:hyperlink>
+    </w:p>
+    <w:p>
+      <w:pPr>
+        <w:tabs>
+          <w:tab w:pos="8787" w:val="right" w:leader="dot"/>
+        </w:tabs>
+        <w:spacing w:before="40" w:after="40"/>
+        <w:ind w:left="397"/>
+      </w:pPr>
+      <w:hyperlink w:anchor="_sec_cosa_fa_per_gli_utenti_finali">
+        <w:r>
+          <w:rPr>
+            <w:rFonts w:ascii="Arial" w:hAnsi="Arial"/>
+            <w:sz w:val="24"/>
+            <w:color w:val="0563C1"/>
+            <w:u w:val="single"/>
+          </w:rPr>
+          <w:t xml:space="preserve">Cosa fa per gli utenti finali</w:t>
+        </w:r>
+        <w:r>
+          <w:rPr>
+            <w:rFonts w:ascii="Arial" w:hAnsi="Arial"/>
+            <w:sz w:val="24"/>
+            <w:color w:val="0563C1"/>
+            <w:u w:val="single"/>
+          </w:rPr>
+          <w:tab/>
+        </w:r>
+        <w:r>
+          <w:rPr>
+            <w:rFonts w:ascii="Arial" w:hAnsi="Arial"/>
+            <w:sz w:val="24"/>
+            <w:color w:val="0563C1"/>
+            <w:u w:val="single"/>
+          </w:rPr>
+          <w:t xml:space="preserve">3</w:t>
+        </w:r>
+      </w:hyperlink>
+    </w:p>
+    <w:p>
+      <w:pPr>
+        <w:tabs>
+          <w:tab w:pos="8787" w:val="right" w:leader="dot"/>
+        </w:tabs>
+        <w:spacing w:before="40" w:after="40"/>
+        <w:ind w:left="397"/>
+      </w:pPr>
+      <w:hyperlink w:anchor="_sec_cos_e_il_pannello_admin">
+        <w:r>
+          <w:rPr>
+            <w:rFonts w:ascii="Arial" w:hAnsi="Arial"/>
+            <w:sz w:val="24"/>
+            <w:color w:val="0563C1"/>
+            <w:u w:val="single"/>
+          </w:rPr>
+          <w:t xml:space="preserve">Cos'è il pannello admin</w:t>
+        </w:r>
+        <w:r>
+          <w:rPr>
+            <w:rFonts w:ascii="Arial" w:hAnsi="Arial"/>
+            <w:sz w:val="24"/>
+            <w:color w:val="0563C1"/>
+            <w:u w:val="single"/>
+          </w:rPr>
+          <w:tab/>
+        </w:r>
+        <w:r>
+          <w:rPr>
+            <w:rFonts w:ascii="Arial" w:hAnsi="Arial"/>
+            <w:sz w:val="24"/>
+            <w:color w:val="0563C1"/>
+            <w:u w:val="single"/>
+          </w:rPr>
+          <w:t xml:space="preserve">3</w:t>
+        </w:r>
+      </w:hyperlink>
+    </w:p>
+    <w:p>
+      <w:pPr>
+        <w:tabs>
+          <w:tab w:pos="8787" w:val="right" w:leader="dot"/>
+        </w:tabs>
+        <w:spacing w:before="40" w:after="40"/>
+      </w:pPr>
+      <w:hyperlink w:anchor="_sec_2_primo_accesso">
+        <w:r>
+          <w:rPr>
+            <w:rFonts w:ascii="Arial" w:hAnsi="Arial"/>
+            <w:sz w:val="24"/>
+            <w:b/>
+            <w:color w:val="0563C1"/>
+            <w:u w:val="single"/>
+          </w:rPr>
+          <w:t xml:space="preserve">2. Primo accesso</w:t>
+        </w:r>
+        <w:r>
+          <w:rPr>
+            <w:rFonts w:ascii="Arial" w:hAnsi="Arial"/>
+            <w:sz w:val="24"/>
+            <w:color w:val="0563C1"/>
+            <w:u w:val="single"/>
+          </w:rPr>
+          <w:tab/>
+        </w:r>
+        <w:r>
+          <w:rPr>
+            <w:rFonts w:ascii="Arial" w:hAnsi="Arial"/>
+            <w:sz w:val="24"/>
+            <w:b/>
+            <w:color w:val="0563C1"/>
+            <w:u w:val="single"/>
+          </w:rPr>
+          <w:t xml:space="preserve">5</w:t>
+        </w:r>
+      </w:hyperlink>
+    </w:p>
+    <w:p>
+      <w:pPr>
+        <w:tabs>
+          <w:tab w:pos="8787" w:val="right" w:leader="dot"/>
+        </w:tabs>
+        <w:spacing w:before="40" w:after="40"/>
+        <w:ind w:left="397"/>
+      </w:pPr>
+      <w:hyperlink w:anchor="_sec_cosa_ti_serve_prima_di_iniziar">
+        <w:r>
+          <w:rPr>
+            <w:rFonts w:ascii="Arial" w:hAnsi="Arial"/>
+            <w:sz w:val="24"/>
+            <w:color w:val="0563C1"/>
+            <w:u w:val="single"/>
+          </w:rPr>
+          <w:t xml:space="preserve">Cosa ti serve prima di iniziare</w:t>
+        </w:r>
+        <w:r>
+          <w:rPr>
+            <w:rFonts w:ascii="Arial" w:hAnsi="Arial"/>
+            <w:sz w:val="24"/>
+            <w:color w:val="0563C1"/>
+            <w:u w:val="single"/>
+          </w:rPr>
+          <w:tab/>
+        </w:r>
+        <w:r>
+          <w:rPr>
+            <w:rFonts w:ascii="Arial" w:hAnsi="Arial"/>
+            <w:sz w:val="24"/>
+            <w:color w:val="0563C1"/>
+            <w:u w:val="single"/>
+          </w:rPr>
+          <w:t xml:space="preserve">5</w:t>
+        </w:r>
+      </w:hyperlink>
+    </w:p>
+    <w:p>
+      <w:pPr>
+        <w:tabs>
+          <w:tab w:pos="8787" w:val="right" w:leader="dot"/>
+        </w:tabs>
+        <w:spacing w:before="40" w:after="40"/>
+        <w:ind w:left="397"/>
+      </w:pPr>
+      <w:hyperlink w:anchor="_sec_apri_il_pannello_admin">
+        <w:r>
+          <w:rPr>
+            <w:rFonts w:ascii="Arial" w:hAnsi="Arial"/>
+            <w:sz w:val="24"/>
+            <w:color w:val="0563C1"/>
+            <w:u w:val="single"/>
+          </w:rPr>
+          <w:t xml:space="preserve">Apri il pannello admin</w:t>
+        </w:r>
+        <w:r>
+          <w:rPr>
+            <w:rFonts w:ascii="Arial" w:hAnsi="Arial"/>
+            <w:sz w:val="24"/>
+            <w:color w:val="0563C1"/>
+            <w:u w:val="single"/>
+          </w:rPr>
+          <w:tab/>
+        </w:r>
+        <w:r>
+          <w:rPr>
+            <w:rFonts w:ascii="Arial" w:hAnsi="Arial"/>
+            <w:sz w:val="24"/>
+            <w:color w:val="0563C1"/>
+            <w:u w:val="single"/>
+          </w:rPr>
+          <w:t xml:space="preserve">5</w:t>
+        </w:r>
+      </w:hyperlink>
+    </w:p>
+    <w:p>
+      <w:pPr>
+        <w:tabs>
+          <w:tab w:pos="8787" w:val="right" w:leader="dot"/>
+        </w:tabs>
+        <w:spacing w:before="40" w:after="40"/>
+        <w:ind w:left="397"/>
+      </w:pPr>
+      <w:hyperlink w:anchor="_sec_configura_github_solo_la_prima">
+        <w:r>
+          <w:rPr>
+            <w:rFonts w:ascii="Arial" w:hAnsi="Arial"/>
+            <w:sz w:val="24"/>
+            <w:color w:val="0563C1"/>
+            <w:u w:val="single"/>
+          </w:rPr>
+          <w:t xml:space="preserve">Configura GitHub (solo la prima volta)</w:t>
+        </w:r>
+        <w:r>
+          <w:rPr>
+            <w:rFonts w:ascii="Arial" w:hAnsi="Arial"/>
+            <w:sz w:val="24"/>
+            <w:color w:val="0563C1"/>
+            <w:u w:val="single"/>
+          </w:rPr>
+          <w:tab/>
+        </w:r>
+        <w:r>
+          <w:rPr>
+            <w:rFonts w:ascii="Arial" w:hAnsi="Arial"/>
+            <w:sz w:val="24"/>
+            <w:color w:val="0563C1"/>
+            <w:u w:val="single"/>
+          </w:rPr>
+          <w:t xml:space="preserve">6</w:t>
+        </w:r>
+      </w:hyperlink>
+    </w:p>
+    <w:p>
+      <w:pPr>
+        <w:tabs>
+          <w:tab w:pos="8787" w:val="right" w:leader="dot"/>
+        </w:tabs>
+        <w:spacing w:before="40" w:after="40"/>
+      </w:pPr>
+      <w:hyperlink w:anchor="_sec_3_operazioni_quotidiane">
+        <w:r>
+          <w:rPr>
+            <w:rFonts w:ascii="Arial" w:hAnsi="Arial"/>
+            <w:sz w:val="24"/>
+            <w:b/>
+            <w:color w:val="0563C1"/>
+            <w:u w:val="single"/>
+          </w:rPr>
+          <w:t xml:space="preserve">3. Operazioni quotidiane</w:t>
+        </w:r>
+        <w:r>
+          <w:rPr>
+            <w:rFonts w:ascii="Arial" w:hAnsi="Arial"/>
+            <w:sz w:val="24"/>
+            <w:color w:val="0563C1"/>
+            <w:u w:val="single"/>
+          </w:rPr>
+          <w:tab/>
+        </w:r>
+        <w:r>
+          <w:rPr>
+            <w:rFonts w:ascii="Arial" w:hAnsi="Arial"/>
+            <w:sz w:val="24"/>
+            <w:b/>
+            <w:color w:val="0563C1"/>
+            <w:u w:val="single"/>
+          </w:rPr>
+          <w:t xml:space="preserve">9</w:t>
+        </w:r>
+      </w:hyperlink>
+    </w:p>
+    <w:p>
+      <w:pPr>
+        <w:tabs>
+          <w:tab w:pos="8787" w:val="right" w:leader="dot"/>
+        </w:tabs>
+        <w:spacing w:before="40" w:after="40"/>
+        <w:ind w:left="397"/>
+      </w:pPr>
+      <w:hyperlink w:anchor="_sec_3_1_aggiungere_una_nuova_promo">
+        <w:r>
+          <w:rPr>
+            <w:rFonts w:ascii="Arial" w:hAnsi="Arial"/>
+            <w:sz w:val="24"/>
+            <w:color w:val="0563C1"/>
+            <w:u w:val="single"/>
+          </w:rPr>
+          <w:t xml:space="preserve">3.1 Aggiungere una nuova promozione</w:t>
+        </w:r>
+        <w:r>
+          <w:rPr>
+            <w:rFonts w:ascii="Arial" w:hAnsi="Arial"/>
+            <w:sz w:val="24"/>
+            <w:color w:val="0563C1"/>
+            <w:u w:val="single"/>
+          </w:rPr>
+          <w:tab/>
+        </w:r>
+        <w:r>
+          <w:rPr>
+            <w:rFonts w:ascii="Arial" w:hAnsi="Arial"/>
+            <w:sz w:val="24"/>
+            <w:color w:val="0563C1"/>
+            <w:u w:val="single"/>
+          </w:rPr>
+          <w:t xml:space="preserve">9</w:t>
+        </w:r>
+      </w:hyperlink>
+    </w:p>
+    <w:p>
+      <w:pPr>
+        <w:tabs>
+          <w:tab w:pos="8787" w:val="right" w:leader="dot"/>
+        </w:tabs>
+        <w:spacing w:before="40" w:after="40"/>
+        <w:ind w:left="397"/>
+      </w:pPr>
+      <w:hyperlink w:anchor="_sec_3_2_modificare_una_promo_esist">
+        <w:r>
+          <w:rPr>
+            <w:rFonts w:ascii="Arial" w:hAnsi="Arial"/>
+            <w:sz w:val="24"/>
+            <w:color w:val="0563C1"/>
+            <w:u w:val="single"/>
+          </w:rPr>
+          <w:t xml:space="preserve">3.2 Modificare una promo esistente</w:t>
+        </w:r>
+        <w:r>
+          <w:rPr>
+            <w:rFonts w:ascii="Arial" w:hAnsi="Arial"/>
+            <w:sz w:val="24"/>
+            <w:color w:val="0563C1"/>
+            <w:u w:val="single"/>
+          </w:rPr>
+          <w:tab/>
+        </w:r>
+        <w:r>
+          <w:rPr>
+            <w:rFonts w:ascii="Arial" w:hAnsi="Arial"/>
+            <w:sz w:val="24"/>
+            <w:color w:val="0563C1"/>
+            <w:u w:val="single"/>
+          </w:rPr>
+          <w:t xml:space="preserve">11</w:t>
+        </w:r>
+      </w:hyperlink>
+    </w:p>
+    <w:p>
+      <w:pPr>
+        <w:tabs>
+          <w:tab w:pos="8787" w:val="right" w:leader="dot"/>
+        </w:tabs>
+        <w:spacing w:before="40" w:after="40"/>
+        <w:ind w:left="397"/>
+      </w:pPr>
+      <w:hyperlink w:anchor="_sec_3_3_disattivare_temporaneament">
+        <w:r>
+          <w:rPr>
+            <w:rFonts w:ascii="Arial" w:hAnsi="Arial"/>
+            <w:sz w:val="24"/>
+            <w:color w:val="0563C1"/>
+            <w:u w:val="single"/>
+          </w:rPr>
+          <w:t xml:space="preserve">3.3 Disattivare temporaneamente una promo</w:t>
+        </w:r>
+        <w:r>
+          <w:rPr>
+            <w:rFonts w:ascii="Arial" w:hAnsi="Arial"/>
+            <w:sz w:val="24"/>
+            <w:color w:val="0563C1"/>
+            <w:u w:val="single"/>
+          </w:rPr>
+          <w:tab/>
+        </w:r>
+        <w:r>
+          <w:rPr>
+            <w:rFonts w:ascii="Arial" w:hAnsi="Arial"/>
+            <w:sz w:val="24"/>
+            <w:color w:val="0563C1"/>
+            <w:u w:val="single"/>
+          </w:rPr>
+          <w:t xml:space="preserve">12</w:t>
+        </w:r>
+      </w:hyperlink>
+    </w:p>
+    <w:p>
+      <w:pPr>
+        <w:tabs>
+          <w:tab w:pos="8787" w:val="right" w:leader="dot"/>
+        </w:tabs>
+        <w:spacing w:before="40" w:after="40"/>
+        <w:ind w:left="397"/>
+      </w:pPr>
+      <w:hyperlink w:anchor="_sec_3_4_riattivare_una_promo_disat">
+        <w:r>
+          <w:rPr>
+            <w:rFonts w:ascii="Arial" w:hAnsi="Arial"/>
+            <w:sz w:val="24"/>
+            <w:color w:val="0563C1"/>
+            <w:u w:val="single"/>
+          </w:rPr>
+          <w:t xml:space="preserve">3.4 Riattivare una promo disattivata</w:t>
+        </w:r>
+        <w:r>
+          <w:rPr>
+            <w:rFonts w:ascii="Arial" w:hAnsi="Arial"/>
+            <w:sz w:val="24"/>
+            <w:color w:val="0563C1"/>
+            <w:u w:val="single"/>
+          </w:rPr>
+          <w:tab/>
+        </w:r>
+        <w:r>
+          <w:rPr>
+            <w:rFonts w:ascii="Arial" w:hAnsi="Arial"/>
+            <w:sz w:val="24"/>
+            <w:color w:val="0563C1"/>
+            <w:u w:val="single"/>
+          </w:rPr>
+          <w:t xml:space="preserve">12</w:t>
+        </w:r>
+      </w:hyperlink>
+    </w:p>
+    <w:p>
+      <w:pPr>
+        <w:tabs>
+          <w:tab w:pos="8787" w:val="right" w:leader="dot"/>
+        </w:tabs>
+        <w:spacing w:before="40" w:after="40"/>
+        <w:ind w:left="397"/>
+      </w:pPr>
+      <w:hyperlink w:anchor="_sec_3_5_eliminare_definitivamente_">
+        <w:r>
+          <w:rPr>
+            <w:rFonts w:ascii="Arial" w:hAnsi="Arial"/>
+            <w:sz w:val="24"/>
+            <w:color w:val="0563C1"/>
+            <w:u w:val="single"/>
+          </w:rPr>
+          <w:t xml:space="preserve">3.5 Eliminare definitivamente una promo</w:t>
+        </w:r>
+        <w:r>
+          <w:rPr>
+            <w:rFonts w:ascii="Arial" w:hAnsi="Arial"/>
+            <w:sz w:val="24"/>
+            <w:color w:val="0563C1"/>
+            <w:u w:val="single"/>
+          </w:rPr>
+          <w:tab/>
+        </w:r>
+        <w:r>
+          <w:rPr>
+            <w:rFonts w:ascii="Arial" w:hAnsi="Arial"/>
+            <w:sz w:val="24"/>
+            <w:color w:val="0563C1"/>
+            <w:u w:val="single"/>
+          </w:rPr>
+          <w:t xml:space="preserve">12</w:t>
+        </w:r>
+      </w:hyperlink>
+    </w:p>
+    <w:p>
+      <w:pPr>
+        <w:tabs>
+          <w:tab w:pos="8787" w:val="right" w:leader="dot"/>
+        </w:tabs>
+        <w:spacing w:before="40" w:after="40"/>
+      </w:pPr>
+      <w:hyperlink w:anchor="_sec_4_le_3_regole_d_oro">
+        <w:r>
+          <w:rPr>
+            <w:rFonts w:ascii="Arial" w:hAnsi="Arial"/>
+            <w:sz w:val="24"/>
+            <w:b/>
+            <w:color w:val="0563C1"/>
+            <w:u w:val="single"/>
+          </w:rPr>
+          <w:t xml:space="preserve">4. Le 3 regole d'oro</w:t>
+        </w:r>
+        <w:r>
+          <w:rPr>
+            <w:rFonts w:ascii="Arial" w:hAnsi="Arial"/>
+            <w:sz w:val="24"/>
+            <w:color w:val="0563C1"/>
+            <w:u w:val="single"/>
+          </w:rPr>
+          <w:tab/>
+        </w:r>
+        <w:r>
+          <w:rPr>
+            <w:rFonts w:ascii="Arial" w:hAnsi="Arial"/>
+            <w:sz w:val="24"/>
+            <w:b/>
+            <w:color w:val="0563C1"/>
+            <w:u w:val="single"/>
+          </w:rPr>
+          <w:t xml:space="preserve">14</w:t>
+        </w:r>
+      </w:hyperlink>
+    </w:p>
+    <w:p>
+      <w:pPr>
+        <w:tabs>
+          <w:tab w:pos="8787" w:val="right" w:leader="dot"/>
+        </w:tabs>
+        <w:spacing w:before="40" w:after="40"/>
+        <w:ind w:left="397"/>
+      </w:pPr>
+      <w:hyperlink w:anchor="_sec_regola_1_prima_di_pubblicare_c">
+        <w:r>
+          <w:rPr>
+            <w:rFonts w:ascii="Arial" w:hAnsi="Arial"/>
+            <w:sz w:val="24"/>
+            <w:color w:val="0563C1"/>
+            <w:u w:val="single"/>
+          </w:rPr>
+          <w:t xml:space="preserve">Regola 1 — Prima di pubblicare, controlla l'anteprima</w:t>
+        </w:r>
+        <w:r>
+          <w:rPr>
+            <w:rFonts w:ascii="Arial" w:hAnsi="Arial"/>
+            <w:sz w:val="24"/>
+            <w:color w:val="0563C1"/>
+            <w:u w:val="single"/>
+          </w:rPr>
+          <w:tab/>
+        </w:r>
+        <w:r>
+          <w:rPr>
+            <w:rFonts w:ascii="Arial" w:hAnsi="Arial"/>
+            <w:sz w:val="24"/>
+            <w:color w:val="0563C1"/>
+            <w:u w:val="single"/>
+          </w:rPr>
+          <w:t xml:space="preserve">14</w:t>
+        </w:r>
+      </w:hyperlink>
+    </w:p>
+    <w:p>
+      <w:pPr>
+        <w:tabs>
+          <w:tab w:pos="8787" w:val="right" w:leader="dot"/>
+        </w:tabs>
+        <w:spacing w:before="40" w:after="40"/>
+        <w:ind w:left="397"/>
+      </w:pPr>
+      <w:hyperlink w:anchor="_sec_regola_2_una_modifica_alla_vol">
+        <w:r>
+          <w:rPr>
+            <w:rFonts w:ascii="Arial" w:hAnsi="Arial"/>
+            <w:sz w:val="24"/>
+            <w:color w:val="0563C1"/>
+            <w:u w:val="single"/>
+          </w:rPr>
+          <w:t xml:space="preserve">Regola 2 — Una modifica alla volta</w:t>
+        </w:r>
+        <w:r>
+          <w:rPr>
+            <w:rFonts w:ascii="Arial" w:hAnsi="Arial"/>
+            <w:sz w:val="24"/>
+            <w:color w:val="0563C1"/>
+            <w:u w:val="single"/>
+          </w:rPr>
+          <w:tab/>
+        </w:r>
+        <w:r>
+          <w:rPr>
+            <w:rFonts w:ascii="Arial" w:hAnsi="Arial"/>
+            <w:sz w:val="24"/>
+            <w:color w:val="0563C1"/>
+            <w:u w:val="single"/>
+          </w:rPr>
+          <w:t xml:space="preserve">14</w:t>
+        </w:r>
+      </w:hyperlink>
+    </w:p>
+    <w:p>
+      <w:pPr>
+        <w:tabs>
+          <w:tab w:pos="8787" w:val="right" w:leader="dot"/>
+        </w:tabs>
+        <w:spacing w:before="40" w:after="40"/>
+        <w:ind w:left="397"/>
+      </w:pPr>
+      <w:hyperlink w:anchor="_sec_regola_3_se_qualcosa_sembra_st">
+        <w:r>
+          <w:rPr>
+            <w:rFonts w:ascii="Arial" w:hAnsi="Arial"/>
+            <w:sz w:val="24"/>
+            <w:color w:val="0563C1"/>
+            <w:u w:val="single"/>
+          </w:rPr>
+          <w:t xml:space="preserve">Regola 3 — Se qualcosa sembra strano, fermati e chiama</w:t>
+        </w:r>
+        <w:r>
+          <w:rPr>
+            <w:rFonts w:ascii="Arial" w:hAnsi="Arial"/>
+            <w:sz w:val="24"/>
+            <w:color w:val="0563C1"/>
+            <w:u w:val="single"/>
+          </w:rPr>
+          <w:tab/>
+        </w:r>
+        <w:r>
+          <w:rPr>
+            <w:rFonts w:ascii="Arial" w:hAnsi="Arial"/>
+            <w:sz w:val="24"/>
+            <w:color w:val="0563C1"/>
+            <w:u w:val="single"/>
+          </w:rPr>
+          <w:t xml:space="preserve">15</w:t>
+        </w:r>
+      </w:hyperlink>
+    </w:p>
+    <w:p>
+      <w:pPr>
+        <w:tabs>
+          <w:tab w:pos="8787" w:val="right" w:leader="dot"/>
+        </w:tabs>
+        <w:spacing w:before="40" w:after="40"/>
+      </w:pPr>
+      <w:hyperlink w:anchor="_sec_5_cosa_fare_se_ho_fatto_un_cas">
+        <w:r>
+          <w:rPr>
+            <w:rFonts w:ascii="Arial" w:hAnsi="Arial"/>
+            <w:sz w:val="24"/>
+            <w:b/>
+            <w:color w:val="0563C1"/>
+            <w:u w:val="single"/>
+          </w:rPr>
+          <w:t xml:space="preserve">5. Cosa fare se ho fatto un casino</w:t>
+        </w:r>
+        <w:r>
+          <w:rPr>
+            <w:rFonts w:ascii="Arial" w:hAnsi="Arial"/>
+            <w:sz w:val="24"/>
+            <w:color w:val="0563C1"/>
+            <w:u w:val="single"/>
+          </w:rPr>
+          <w:tab/>
+        </w:r>
+        <w:r>
+          <w:rPr>
+            <w:rFonts w:ascii="Arial" w:hAnsi="Arial"/>
+            <w:sz w:val="24"/>
+            <w:b/>
+            <w:color w:val="0563C1"/>
+            <w:u w:val="single"/>
+          </w:rPr>
+          <w:t xml:space="preserve">16</w:t>
+        </w:r>
+      </w:hyperlink>
+    </w:p>
+    <w:p>
+      <w:pPr>
+        <w:tabs>
+          <w:tab w:pos="8787" w:val="right" w:leader="dot"/>
+        </w:tabs>
+        <w:spacing w:before="40" w:after="40"/>
+        <w:ind w:left="397"/>
+      </w:pPr>
+      <w:hyperlink w:anchor="_sec_procedura_di_emergenza_standar">
+        <w:r>
+          <w:rPr>
+            <w:rFonts w:ascii="Arial" w:hAnsi="Arial"/>
+            <w:sz w:val="24"/>
+            <w:color w:val="0563C1"/>
+            <w:u w:val="single"/>
+          </w:rPr>
+          <w:t xml:space="preserve">Procedura di emergenza standard</w:t>
+        </w:r>
+        <w:r>
+          <w:rPr>
+            <w:rFonts w:ascii="Arial" w:hAnsi="Arial"/>
+            <w:sz w:val="24"/>
+            <w:color w:val="0563C1"/>
+            <w:u w:val="single"/>
+          </w:rPr>
+          <w:tab/>
+        </w:r>
+        <w:r>
+          <w:rPr>
+            <w:rFonts w:ascii="Arial" w:hAnsi="Arial"/>
+            <w:sz w:val="24"/>
+            <w:color w:val="0563C1"/>
+            <w:u w:val="single"/>
+          </w:rPr>
+          <w:t xml:space="preserve">16</w:t>
+        </w:r>
+      </w:hyperlink>
+    </w:p>
+    <w:p>
+      <w:pPr>
+        <w:tabs>
+          <w:tab w:pos="8787" w:val="right" w:leader="dot"/>
+        </w:tabs>
+        <w:spacing w:before="40" w:after="40"/>
+        <w:ind w:left="397"/>
+      </w:pPr>
+      <w:hyperlink w:anchor="_sec_se_alessandro_non_e_raggiungib">
+        <w:r>
+          <w:rPr>
+            <w:rFonts w:ascii="Arial" w:hAnsi="Arial"/>
+            <w:sz w:val="24"/>
+            <w:color w:val="0563C1"/>
+            <w:u w:val="single"/>
+          </w:rPr>
+          <w:t xml:space="preserve">Se Alessandro non è raggiungibile e devi recuperare in autonomia</w:t>
+        </w:r>
+        <w:r>
+          <w:rPr>
+            <w:rFonts w:ascii="Arial" w:hAnsi="Arial"/>
+            <w:sz w:val="24"/>
+            <w:color w:val="0563C1"/>
+            <w:u w:val="single"/>
+          </w:rPr>
+          <w:tab/>
+        </w:r>
+        <w:r>
+          <w:rPr>
+            <w:rFonts w:ascii="Arial" w:hAnsi="Arial"/>
+            <w:sz w:val="24"/>
+            <w:color w:val="0563C1"/>
+            <w:u w:val="single"/>
+          </w:rPr>
+          <w:t xml:space="preserve">16</w:t>
+        </w:r>
+      </w:hyperlink>
+    </w:p>
+    <w:p>
+      <w:pPr>
+        <w:tabs>
+          <w:tab w:pos="8787" w:val="right" w:leader="dot"/>
+        </w:tabs>
+        <w:spacing w:before="40" w:after="40"/>
+      </w:pPr>
+      <w:hyperlink w:anchor="_sec_6_faq_domande_frequenti">
+        <w:r>
+          <w:rPr>
+            <w:rFonts w:ascii="Arial" w:hAnsi="Arial"/>
+            <w:sz w:val="24"/>
+            <w:b/>
+            <w:color w:val="0563C1"/>
+            <w:u w:val="single"/>
+          </w:rPr>
+          <w:t xml:space="preserve">6. FAQ — Domande frequenti</w:t>
+        </w:r>
+        <w:r>
+          <w:rPr>
+            <w:rFonts w:ascii="Arial" w:hAnsi="Arial"/>
+            <w:sz w:val="24"/>
+            <w:color w:val="0563C1"/>
+            <w:u w:val="single"/>
+          </w:rPr>
+          <w:tab/>
+        </w:r>
+        <w:r>
+          <w:rPr>
+            <w:rFonts w:ascii="Arial" w:hAnsi="Arial"/>
+            <w:sz w:val="24"/>
+            <w:b/>
+            <w:color w:val="0563C1"/>
+            <w:u w:val="single"/>
+          </w:rPr>
+          <w:t xml:space="preserve">18</w:t>
+        </w:r>
+      </w:hyperlink>
+    </w:p>
+    <w:p>
+      <w:pPr>
+        <w:tabs>
+          <w:tab w:pos="8787" w:val="right" w:leader="dot"/>
+        </w:tabs>
+        <w:spacing w:before="40" w:after="40"/>
+      </w:pPr>
+      <w:hyperlink w:anchor="_sec_contatti_rapidi">
+        <w:r>
+          <w:rPr>
+            <w:rFonts w:ascii="Arial" w:hAnsi="Arial"/>
+            <w:sz w:val="24"/>
+            <w:b/>
+            <w:color w:val="0563C1"/>
+            <w:u w:val="single"/>
+          </w:rPr>
+          <w:t xml:space="preserve">Contatti rapidi</w:t>
+        </w:r>
+        <w:r>
+          <w:rPr>
+            <w:rFonts w:ascii="Arial" w:hAnsi="Arial"/>
+            <w:sz w:val="24"/>
+            <w:color w:val="0563C1"/>
+            <w:u w:val="single"/>
+          </w:rPr>
+          <w:tab/>
+        </w:r>
+        <w:r>
+          <w:rPr>
+            <w:rFonts w:ascii="Arial" w:hAnsi="Arial"/>
+            <w:sz w:val="24"/>
+            <w:b/>
+            <w:color w:val="0563C1"/>
+            <w:u w:val="single"/>
+          </w:rPr>
+          <w:t xml:space="preserve">20</w:t>
+        </w:r>
+      </w:hyperlink>
     </w:p>
     <w:p>
       <w:r>
@@ -141,6 +977,7 @@
         <w:pStyle w:val="Heading1"/>
         <w:spacing w:before="240" w:after="160"/>
       </w:pPr>
+      <w:bookmarkStart w:id="1" w:name="_sec_1_cos_e_il_configuratore_listi"/>
       <w:r>
         <w:rPr>
           <w:rFonts w:ascii="Arial" w:hAnsi="Arial"/>
@@ -149,6 +986,7 @@
         </w:rPr>
         <w:t>1. Cos'è il Configuratore Listino</w:t>
       </w:r>
+      <w:bookmarkEnd w:id="1"/>
     </w:p>
     <w:p>
       <w:r>
@@ -184,6 +1022,7 @@
         <w:pStyle w:val="Heading2"/>
         <w:spacing w:before="200" w:after="120"/>
       </w:pPr>
+      <w:bookmarkStart w:id="2" w:name="_sec_cosa_fa_per_gli_utenti_finali"/>
       <w:r>
         <w:rPr>
           <w:rFonts w:ascii="Arial" w:hAnsi="Arial"/>
@@ -192,6 +1031,7 @@
         </w:rPr>
         <w:t>Cosa fa per gli utenti finali</w:t>
       </w:r>
+      <w:bookmarkEnd w:id="2"/>
     </w:p>
     <w:p>
       <w:r>
@@ -289,6 +1129,7 @@
         <w:pStyle w:val="Heading2"/>
         <w:spacing w:before="200" w:after="120"/>
       </w:pPr>
+      <w:bookmarkStart w:id="3" w:name="_sec_cos_e_il_pannello_admin"/>
       <w:r>
         <w:rPr>
           <w:rFonts w:ascii="Arial" w:hAnsi="Arial"/>
@@ -297,6 +1138,7 @@
         </w:rPr>
         <w:t>Cos'è il pannello admin</w:t>
       </w:r>
+      <w:bookmarkEnd w:id="3"/>
     </w:p>
     <w:p>
       <w:r>
@@ -488,6 +1330,7 @@
         <w:pStyle w:val="Heading1"/>
         <w:spacing w:before="240" w:after="160"/>
       </w:pPr>
+      <w:bookmarkStart w:id="4" w:name="_sec_2_primo_accesso"/>
       <w:r>
         <w:rPr>
           <w:rFonts w:ascii="Arial" w:hAnsi="Arial"/>
@@ -496,12 +1339,14 @@
         </w:rPr>
         <w:t>2. Primo accesso</w:t>
       </w:r>
+      <w:bookmarkEnd w:id="4"/>
     </w:p>
     <w:p>
       <w:pPr>
         <w:pStyle w:val="Heading2"/>
         <w:spacing w:before="200" w:after="120"/>
       </w:pPr>
+      <w:bookmarkStart w:id="5" w:name="_sec_cosa_ti_serve_prima_di_iniziar"/>
       <w:r>
         <w:rPr>
           <w:rFonts w:ascii="Arial" w:hAnsi="Arial"/>
@@ -510,6 +1355,7 @@
         </w:rPr>
         <w:t>Cosa ti serve prima di iniziare</w:t>
       </w:r>
+      <w:bookmarkEnd w:id="5"/>
     </w:p>
     <w:p>
       <w:pPr>
@@ -673,6 +1519,7 @@
         <w:pStyle w:val="Heading2"/>
         <w:spacing w:before="200" w:after="120"/>
       </w:pPr>
+      <w:bookmarkStart w:id="6" w:name="_sec_apri_il_pannello_admin"/>
       <w:r>
         <w:rPr>
           <w:rFonts w:ascii="Arial" w:hAnsi="Arial"/>
@@ -681,6 +1528,7 @@
         </w:rPr>
         <w:t>Apri il pannello admin</w:t>
       </w:r>
+      <w:bookmarkEnd w:id="6"/>
     </w:p>
     <w:p>
       <w:pPr>
@@ -853,6 +1701,7 @@
         <w:pStyle w:val="Heading2"/>
         <w:spacing w:before="200" w:after="120"/>
       </w:pPr>
+      <w:bookmarkStart w:id="7" w:name="_sec_configura_github_solo_la_prima"/>
       <w:r>
         <w:rPr>
           <w:rFonts w:ascii="Arial" w:hAnsi="Arial"/>
@@ -861,6 +1710,7 @@
         </w:rPr>
         <w:t>Configura GitHub (solo la prima volta)</w:t>
       </w:r>
+      <w:bookmarkEnd w:id="7"/>
     </w:p>
     <w:p>
       <w:r>
@@ -1676,6 +2526,7 @@
         <w:pStyle w:val="Heading1"/>
         <w:spacing w:before="240" w:after="160"/>
       </w:pPr>
+      <w:bookmarkStart w:id="8" w:name="_sec_3_operazioni_quotidiane"/>
       <w:r>
         <w:rPr>
           <w:rFonts w:ascii="Arial" w:hAnsi="Arial"/>
@@ -1684,6 +2535,7 @@
         </w:rPr>
         <w:t>3. Operazioni quotidiane</w:t>
       </w:r>
+      <w:bookmarkEnd w:id="8"/>
     </w:p>
     <w:p>
       <w:r>
@@ -1709,6 +2561,7 @@
         <w:pStyle w:val="Heading2"/>
         <w:spacing w:before="200" w:after="120"/>
       </w:pPr>
+      <w:bookmarkStart w:id="9" w:name="_sec_3_1_aggiungere_una_nuova_promo"/>
       <w:r>
         <w:rPr>
           <w:rFonts w:ascii="Arial" w:hAnsi="Arial"/>
@@ -1717,6 +2570,7 @@
         </w:rPr>
         <w:t>3.1 Aggiungere una nuova promozione</w:t>
       </w:r>
+      <w:bookmarkEnd w:id="9"/>
     </w:p>
     <w:p>
       <w:pPr>
@@ -2301,6 +3155,7 @@
         <w:pStyle w:val="Heading2"/>
         <w:spacing w:before="200" w:after="120"/>
       </w:pPr>
+      <w:bookmarkStart w:id="10" w:name="_sec_3_2_modificare_una_promo_esist"/>
       <w:r>
         <w:rPr>
           <w:rFonts w:ascii="Arial" w:hAnsi="Arial"/>
@@ -2309,6 +3164,7 @@
         </w:rPr>
         <w:t>3.2 Modificare una promo esistente</w:t>
       </w:r>
+      <w:bookmarkEnd w:id="10"/>
     </w:p>
     <w:p>
       <w:r>
@@ -2573,6 +3429,7 @@
         <w:pStyle w:val="Heading2"/>
         <w:spacing w:before="200" w:after="120"/>
       </w:pPr>
+      <w:bookmarkStart w:id="11" w:name="_sec_3_3_disattivare_temporaneament"/>
       <w:r>
         <w:rPr>
           <w:rFonts w:ascii="Arial" w:hAnsi="Arial"/>
@@ -2581,6 +3438,7 @@
         </w:rPr>
         <w:t>3.3 Disattivare temporaneamente una promo</w:t>
       </w:r>
+      <w:bookmarkEnd w:id="11"/>
     </w:p>
     <w:p>
       <w:r>
@@ -2734,6 +3592,7 @@
         <w:pStyle w:val="Heading2"/>
         <w:spacing w:before="200" w:after="120"/>
       </w:pPr>
+      <w:bookmarkStart w:id="12" w:name="_sec_3_4_riattivare_una_promo_disat"/>
       <w:r>
         <w:rPr>
           <w:rFonts w:ascii="Arial" w:hAnsi="Arial"/>
@@ -2742,6 +3601,7 @@
         </w:rPr>
         <w:t>3.4 Riattivare una promo disattivata</w:t>
       </w:r>
+      <w:bookmarkEnd w:id="12"/>
     </w:p>
     <w:p>
       <w:pPr>
@@ -2808,6 +3668,7 @@
         <w:pStyle w:val="Heading2"/>
         <w:spacing w:before="200" w:after="120"/>
       </w:pPr>
+      <w:bookmarkStart w:id="13" w:name="_sec_3_5_eliminare_definitivamente_"/>
       <w:r>
         <w:rPr>
           <w:rFonts w:ascii="Arial" w:hAnsi="Arial"/>
@@ -2816,6 +3677,7 @@
         </w:rPr>
         <w:t>3.5 Eliminare definitivamente una promo</w:t>
       </w:r>
+      <w:bookmarkEnd w:id="13"/>
     </w:p>
     <w:tbl>
       <w:tblPr>
@@ -3020,6 +3882,7 @@
         <w:pStyle w:val="Heading1"/>
         <w:spacing w:before="240" w:after="160"/>
       </w:pPr>
+      <w:bookmarkStart w:id="14" w:name="_sec_4_le_3_regole_d_oro"/>
       <w:r>
         <w:rPr>
           <w:rFonts w:ascii="Arial" w:hAnsi="Arial"/>
@@ -3028,6 +3891,7 @@
         </w:rPr>
         <w:t>4. Le 3 regole d'oro</w:t>
       </w:r>
+      <w:bookmarkEnd w:id="14"/>
     </w:p>
     <w:p>
       <w:r>
@@ -3053,6 +3917,7 @@
         <w:pStyle w:val="Heading2"/>
         <w:spacing w:before="200" w:after="120"/>
       </w:pPr>
+      <w:bookmarkStart w:id="15" w:name="_sec_regola_1_prima_di_pubblicare_c"/>
       <w:r>
         <w:rPr>
           <w:rFonts w:ascii="Arial" w:hAnsi="Arial"/>
@@ -3061,6 +3926,7 @@
         </w:rPr>
         <w:t>Regola 1 — Prima di pubblicare, controlla l'anteprima</w:t>
       </w:r>
+      <w:bookmarkEnd w:id="15"/>
     </w:p>
     <w:p>
       <w:r>
@@ -3202,6 +4068,7 @@
         <w:pStyle w:val="Heading2"/>
         <w:spacing w:before="200" w:after="120"/>
       </w:pPr>
+      <w:bookmarkStart w:id="16" w:name="_sec_regola_2_una_modifica_alla_vol"/>
       <w:r>
         <w:rPr>
           <w:rFonts w:ascii="Arial" w:hAnsi="Arial"/>
@@ -3210,6 +4077,7 @@
         </w:rPr>
         <w:t>Regola 2 — Una modifica alla volta</w:t>
       </w:r>
+      <w:bookmarkEnd w:id="16"/>
     </w:p>
     <w:p>
       <w:r>
@@ -3293,6 +4161,7 @@
         <w:pStyle w:val="Heading2"/>
         <w:spacing w:before="200" w:after="120"/>
       </w:pPr>
+      <w:bookmarkStart w:id="17" w:name="_sec_regola_3_se_qualcosa_sembra_st"/>
       <w:r>
         <w:rPr>
           <w:rFonts w:ascii="Arial" w:hAnsi="Arial"/>
@@ -3301,6 +4170,7 @@
         </w:rPr>
         <w:t>Regola 3 — Se qualcosa sembra strano, fermati e chiama</w:t>
       </w:r>
+      <w:bookmarkEnd w:id="17"/>
     </w:p>
     <w:p>
       <w:r>
@@ -3461,6 +4331,7 @@
         <w:pStyle w:val="Heading1"/>
         <w:spacing w:before="240" w:after="160"/>
       </w:pPr>
+      <w:bookmarkStart w:id="18" w:name="_sec_5_cosa_fare_se_ho_fatto_un_cas"/>
       <w:r>
         <w:rPr>
           <w:rFonts w:ascii="Arial" w:hAnsi="Arial"/>
@@ -3469,6 +4340,7 @@
         </w:rPr>
         <w:t>5. Cosa fare se ho fatto un casino</w:t>
       </w:r>
+      <w:bookmarkEnd w:id="18"/>
     </w:p>
     <w:tbl>
       <w:tblPr>
@@ -3543,6 +4415,7 @@
         <w:pStyle w:val="Heading2"/>
         <w:spacing w:before="200" w:after="120"/>
       </w:pPr>
+      <w:bookmarkStart w:id="19" w:name="_sec_procedura_di_emergenza_standar"/>
       <w:r>
         <w:rPr>
           <w:rFonts w:ascii="Arial" w:hAnsi="Arial"/>
@@ -3551,6 +4424,7 @@
         </w:rPr>
         <w:t>Procedura di emergenza standard</w:t>
       </w:r>
+      <w:bookmarkEnd w:id="19"/>
     </w:p>
     <w:p>
       <w:pPr>
@@ -3605,6 +4479,7 @@
         <w:pStyle w:val="Heading2"/>
         <w:spacing w:before="200" w:after="120"/>
       </w:pPr>
+      <w:bookmarkStart w:id="20" w:name="_sec_se_alessandro_non_e_raggiungib"/>
       <w:r>
         <w:rPr>
           <w:rFonts w:ascii="Arial" w:hAnsi="Arial"/>
@@ -3613,6 +4488,7 @@
         </w:rPr>
         <w:t>Se Alessandro non è raggiungibile e devi recuperare in autonomia</w:t>
       </w:r>
+      <w:bookmarkEnd w:id="20"/>
     </w:p>
     <w:tbl>
       <w:tblPr>
@@ -3877,6 +4753,7 @@
         <w:pStyle w:val="Heading1"/>
         <w:spacing w:before="240" w:after="160"/>
       </w:pPr>
+      <w:bookmarkStart w:id="21" w:name="_sec_6_faq_domande_frequenti"/>
       <w:r>
         <w:rPr>
           <w:rFonts w:ascii="Arial" w:hAnsi="Arial"/>
@@ -3885,6 +4762,7 @@
         </w:rPr>
         <w:t>6. FAQ — Domande frequenti</w:t>
       </w:r>
+      <w:bookmarkEnd w:id="21"/>
     </w:p>
     <w:p>
       <w:pPr>
@@ -4305,6 +5183,7 @@
         <w:pStyle w:val="Heading1"/>
         <w:spacing w:before="240" w:after="160"/>
       </w:pPr>
+      <w:bookmarkStart w:id="22" w:name="_sec_contatti_rapidi"/>
       <w:r>
         <w:rPr>
           <w:rFonts w:ascii="Arial" w:hAnsi="Arial"/>
@@ -4313,6 +5192,7 @@
         </w:rPr>
         <w:t>Contatti rapidi</w:t>
       </w:r>
+      <w:bookmarkEnd w:id="22"/>
     </w:p>
     <w:p>
       <w:r>

</xml_diff>

<commit_message>
Fix MANUALE_OPERATORE: Sezione 5 semplificata, niente più rimandi a GitHub per l'operatore
Co-Authored-By: Claude Opus 4.7 (1M context) <noreply@anthropic.com>
</commit_message>
<xml_diff>
--- a/MANUALE_OPERATORE.docx
+++ b/MANUALE_OPERATORE.docx
@@ -806,82 +806,6 @@
             <w:rFonts w:ascii="Arial" w:hAnsi="Arial"/>
             <w:sz w:val="24"/>
             <w:b/>
-            <w:color w:val="0563C1"/>
-            <w:u w:val="single"/>
-          </w:rPr>
-          <w:t xml:space="preserve">16</w:t>
-        </w:r>
-      </w:hyperlink>
-    </w:p>
-    <w:p>
-      <w:pPr>
-        <w:tabs>
-          <w:tab w:pos="8787" w:val="right" w:leader="dot"/>
-        </w:tabs>
-        <w:spacing w:before="40" w:after="40"/>
-        <w:ind w:left="397"/>
-      </w:pPr>
-      <w:hyperlink w:anchor="_sec_procedura_di_emergenza_standar">
-        <w:r>
-          <w:rPr>
-            <w:rFonts w:ascii="Arial" w:hAnsi="Arial"/>
-            <w:sz w:val="24"/>
-            <w:color w:val="0563C1"/>
-            <w:u w:val="single"/>
-          </w:rPr>
-          <w:t xml:space="preserve">Procedura di emergenza standard</w:t>
-        </w:r>
-        <w:r>
-          <w:rPr>
-            <w:rFonts w:ascii="Arial" w:hAnsi="Arial"/>
-            <w:sz w:val="24"/>
-            <w:color w:val="0563C1"/>
-            <w:u w:val="single"/>
-          </w:rPr>
-          <w:tab/>
-        </w:r>
-        <w:r>
-          <w:rPr>
-            <w:rFonts w:ascii="Arial" w:hAnsi="Arial"/>
-            <w:sz w:val="24"/>
-            <w:color w:val="0563C1"/>
-            <w:u w:val="single"/>
-          </w:rPr>
-          <w:t xml:space="preserve">16</w:t>
-        </w:r>
-      </w:hyperlink>
-    </w:p>
-    <w:p>
-      <w:pPr>
-        <w:tabs>
-          <w:tab w:pos="8787" w:val="right" w:leader="dot"/>
-        </w:tabs>
-        <w:spacing w:before="40" w:after="40"/>
-        <w:ind w:left="397"/>
-      </w:pPr>
-      <w:hyperlink w:anchor="_sec_se_alessandro_non_e_raggiungib">
-        <w:r>
-          <w:rPr>
-            <w:rFonts w:ascii="Arial" w:hAnsi="Arial"/>
-            <w:sz w:val="24"/>
-            <w:color w:val="0563C1"/>
-            <w:u w:val="single"/>
-          </w:rPr>
-          <w:t xml:space="preserve">Se Alessandro non è raggiungibile e devi recuperare in autonomia</w:t>
-        </w:r>
-        <w:r>
-          <w:rPr>
-            <w:rFonts w:ascii="Arial" w:hAnsi="Arial"/>
-            <w:sz w:val="24"/>
-            <w:color w:val="0563C1"/>
-            <w:u w:val="single"/>
-          </w:rPr>
-          <w:tab/>
-        </w:r>
-        <w:r>
-          <w:rPr>
-            <w:rFonts w:ascii="Arial" w:hAnsi="Arial"/>
-            <w:sz w:val="24"/>
             <w:color w:val="0563C1"/>
             <w:u w:val="single"/>
           </w:rPr>
@@ -4399,7 +4323,7 @@
                 <w:rFonts w:ascii="Arial" w:hAnsi="Arial"/>
                 <w:sz w:val="22"/>
               </w:rPr>
-              <w:t>Anche se hai cancellato qualcosa per errore, anche se hai pubblicato una promo sbagliata, anche se hai fatto qualcosa che non dovevi: tutto è recuperabile. GitHub salva ogni modifica con la cronologia. Il sistema salva anche localmente le ultime 5 versioni della tua bozza nel browser. Niente è perso davvero.</w:t>
+              <w:t>Anche se hai cancellato qualcosa per errore, anche se hai pubblicato una promo sbagliata, anche se hai fatto qualcosa che non dovevi: tutto è recuperabile. Alessandro ha gli strumenti per ripristinare qualsiasi modifica in pochi minuti.</w:t>
             </w:r>
           </w:p>
         </w:tc>
@@ -4411,20 +4335,14 @@
       </w:pPr>
     </w:p>
     <w:p>
-      <w:pPr>
-        <w:pStyle w:val="Heading2"/>
-        <w:spacing w:before="200" w:after="120"/>
-      </w:pPr>
-      <w:bookmarkStart w:id="19" w:name="_sec_procedura_di_emergenza_standar"/>
       <w:r>
         <w:rPr>
           <w:rFonts w:ascii="Arial" w:hAnsi="Arial"/>
-          <w:color w:val="374151"/>
-          <w:sz w:val="32"/>
+          <w:b/>
+          <w:sz w:val="24"/>
         </w:rPr>
-        <w:t>Procedura di emergenza standard</w:t>
+        <w:t>Procedura unica:</w:t>
       </w:r>
-      <w:bookmarkEnd w:id="19"/>
     </w:p>
     <w:p>
       <w:pPr>
@@ -4435,7 +4353,7 @@
           <w:rFonts w:ascii="Arial" w:hAnsi="Arial"/>
           <w:sz w:val="24"/>
         </w:rPr>
-        <w:t>Ferma tutto: non premere altri pulsanti, non chiudere il browser, non spegnere il computer.</w:t>
+        <w:t>Ferma tutto: non premere altri pulsanti, non chiudere il browser, non spegnere il computer. NON aprire github.com per cercare di sistemare da solo.</w:t>
       </w:r>
     </w:p>
     <w:p>
@@ -4459,149 +4377,59 @@
           <w:rFonts w:ascii="Arial" w:hAnsi="Arial"/>
           <w:sz w:val="24"/>
         </w:rPr>
-        <w:t>Descrivi cosa hai fatto e cosa è successo. Più dettagli dai, più veloce è il recupero. Esempio buono: "Ho premuto Elimina sulla promo X invece di Disattiva, e adesso non la vedo più nella lista."</w:t>
+        <w:t>Se non risponde subito, lascia un messaggio WhatsApp con queste informazioni:</w:t>
       </w:r>
     </w:p>
     <w:p>
       <w:pPr>
-        <w:pStyle w:val="ListNumber"/>
+        <w:pStyle w:val="ListBullet"/>
+        <w:ind w:left="283"/>
       </w:pPr>
       <w:r>
         <w:rPr>
           <w:rFonts w:ascii="Arial" w:hAnsi="Arial"/>
           <w:sz w:val="24"/>
         </w:rPr>
-        <w:t>Se Alessandro ti dice di fare qualcosa, fallo. Se ti dice di non toccare nulla, non toccare nulla.</w:t>
+        <w:t>Cosa stavi facendo (es. "stavo modificando la promo X").</w:t>
       </w:r>
     </w:p>
     <w:p>
       <w:pPr>
-        <w:pStyle w:val="Heading2"/>
-        <w:spacing w:before="200" w:after="120"/>
-      </w:pPr>
-      <w:bookmarkStart w:id="20" w:name="_sec_se_alessandro_non_e_raggiungib"/>
-      <w:r>
-        <w:rPr>
-          <w:rFonts w:ascii="Arial" w:hAnsi="Arial"/>
-          <w:color w:val="374151"/>
-          <w:sz w:val="32"/>
-        </w:rPr>
-        <w:t>Se Alessandro non è raggiungibile e devi recuperare in autonomia</w:t>
-      </w:r>
-      <w:bookmarkEnd w:id="20"/>
-    </w:p>
-    <w:tbl>
-      <w:tblPr>
-        <w:tblW w:type="auto" w:w="0"/>
-        <w:jc w:val="center"/>
-        <w:tblLayout w:type="fixed"/>
-        <w:tblLook w:firstColumn="1" w:firstRow="1" w:lastColumn="0" w:lastRow="0" w:noHBand="0" w:noVBand="1" w:val="04A0"/>
-      </w:tblPr>
-      <w:tblGrid>
-        <w:gridCol w:w="8787"/>
-      </w:tblGrid>
-      <w:tr>
-        <w:tc>
-          <w:tcPr>
-            <w:tcW w:type="dxa" w:w="8787"/>
-            <w:shd w:val="clear" w:color="auto" w:fill="FAE5D3"/>
-            <w:tcBorders>
-              <w:top w:val="single" w:sz="8" w:color="BA4A00"/>
-              <w:left w:val="single" w:sz="8" w:color="BA4A00"/>
-              <w:bottom w:val="single" w:sz="8" w:color="BA4A00"/>
-              <w:right w:val="single" w:sz="8" w:color="BA4A00"/>
-            </w:tcBorders>
-          </w:tcPr>
-          <w:p>
-            <w:r/>
-            <w:r>
-              <w:rPr>
-                <w:rFonts w:ascii="Arial" w:hAnsi="Arial"/>
-                <w:b/>
-                <w:color w:val="BA4A00"/>
-                <w:sz w:val="22"/>
-              </w:rPr>
-              <w:t>⚠ ATTENZIONE</w:t>
-            </w:r>
-          </w:p>
-          <w:p>
-            <w:r>
-              <w:rPr>
-                <w:rFonts w:ascii="Arial" w:hAnsi="Arial"/>
-                <w:sz w:val="22"/>
-              </w:rPr>
-              <w:t>Usa questa procedura SOLO se è urgente e Alessandro non risponde entro qualche ora.</w:t>
-            </w:r>
-          </w:p>
-          <w:p>
-            <w:r>
-              <w:rPr>
-                <w:rFonts w:ascii="Arial" w:hAnsi="Arial"/>
-                <w:sz w:val="22"/>
-              </w:rPr>
-            </w:r>
-          </w:p>
-          <w:p>
-            <w:r>
-              <w:rPr>
-                <w:rFonts w:ascii="Arial" w:hAnsi="Arial"/>
-                <w:sz w:val="22"/>
-              </w:rPr>
-              <w:t>In tutti gli altri casi, aspetta. La fretta è il nemico del recupero.</w:t>
-            </w:r>
-          </w:p>
-        </w:tc>
-      </w:tr>
-    </w:tbl>
-    <w:p>
-      <w:pPr>
-        <w:spacing w:after="120"/>
-      </w:pPr>
-    </w:p>
-    <w:p>
-      <w:pPr>
-        <w:pStyle w:val="ListNumber"/>
+        <w:pStyle w:val="ListBullet"/>
+        <w:ind w:left="283"/>
       </w:pPr>
       <w:r>
         <w:rPr>
           <w:rFonts w:ascii="Arial" w:hAnsi="Arial"/>
           <w:sz w:val="24"/>
         </w:rPr>
-        <w:t>Apri il browser e vai a questo indirizzo:</w:t>
+        <w:t>Cosa è successo (es. "ho premuto Elimina invece di Disattiva").</w:t>
       </w:r>
     </w:p>
     <w:p>
-      <w:r>
-        <w:rPr>
-          <w:rFonts w:ascii="Arial" w:hAnsi="Arial"/>
-          <w:b/>
-          <w:sz w:val="24"/>
-        </w:rPr>
-        <w:t xml:space="preserve">    https://github.com/pezzaliapp/listino-configuratore/commits/main/promo/promo.json</w:t>
-      </w:r>
-    </w:p>
-    <w:p>
-      <w:pPr>
-        <w:pStyle w:val="ListNumber"/>
+      <w:pPr>
+        <w:pStyle w:val="ListBullet"/>
+        <w:ind w:left="283"/>
       </w:pPr>
       <w:r>
         <w:rPr>
           <w:rFonts w:ascii="Arial" w:hAnsi="Arial"/>
           <w:sz w:val="24"/>
         </w:rPr>
-        <w:t>Vedrai una lista di tutte le modifiche fatte al file delle promozioni nel tempo, dal più recente al più vecchio. Ogni riga mostra una piccola descrizione e una data.</w:t>
+        <w:t>Da quanto tempo (es. "circa 5 minuti fa").</w:t>
       </w:r>
     </w:p>
     <w:p>
       <w:pPr>
-        <w:pStyle w:val="ListNumber"/>
+        <w:pStyle w:val="ListBullet"/>
+        <w:ind w:left="283"/>
       </w:pPr>
       <w:r>
         <w:rPr>
           <w:rFonts w:ascii="Arial" w:hAnsi="Arial"/>
           <w:sz w:val="24"/>
         </w:rPr>
-        <w:t>Trova la versione precedente al tuo errore (la riga sopra al tuo ultimo commit).</w:t>
+        <w:t>Uno screenshot del pannello admin in cui sei adesso (Cmd+Shift+4 su Mac, Strumento di cattura su Windows).</w:t>
       </w:r>
     </w:p>
     <w:p>
@@ -4613,7 +4441,7 @@
           <w:rFonts w:ascii="Arial" w:hAnsi="Arial"/>
           <w:sz w:val="24"/>
         </w:rPr>
-        <w:t>Cliccaci sopra: ti porta alla pagina di quella modifica.</w:t>
+        <w:t>Non toccare più il pannello admin finché Alessandro non ti dice cosa fare. Aspetta. Niente fretta: anche se passa qualche ora prima della risposta, il sistema continua a funzionare con la versione attuale, quindi gli utenti finali vedono le promo che c'erano fino a un attimo prima del tuo errore.</w:t>
       </w:r>
     </w:p>
     <w:p>
@@ -4625,45 +4453,7 @@
           <w:rFonts w:ascii="Arial" w:hAnsi="Arial"/>
           <w:sz w:val="24"/>
         </w:rPr>
-        <w:t>NON FARE NULLA QUI. Limitati a:</w:t>
-      </w:r>
-    </w:p>
-    <w:p>
-      <w:pPr>
-        <w:pStyle w:val="ListBullet"/>
-        <w:ind w:left="283"/>
-      </w:pPr>
-      <w:r>
-        <w:rPr>
-          <w:rFonts w:ascii="Arial" w:hAnsi="Arial"/>
-          <w:sz w:val="24"/>
-        </w:rPr>
-        <w:t>Fare uno screenshot della pagina (Cmd+Shift+4 su Mac, Strumento di cattura su Windows).</w:t>
-      </w:r>
-    </w:p>
-    <w:p>
-      <w:pPr>
-        <w:pStyle w:val="ListBullet"/>
-        <w:ind w:left="283"/>
-      </w:pPr>
-      <w:r>
-        <w:rPr>
-          <w:rFonts w:ascii="Arial" w:hAnsi="Arial"/>
-          <w:sz w:val="24"/>
-        </w:rPr>
-        <w:t>Mandarlo ad Alessandro su WhatsApp con la nota: "Sto recuperando perché non ti ho trovato. Ti mando lo screenshot della versione che voglio ripristinare."</w:t>
-      </w:r>
-    </w:p>
-    <w:p>
-      <w:pPr>
-        <w:pStyle w:val="ListNumber"/>
-      </w:pPr>
-      <w:r>
-        <w:rPr>
-          <w:rFonts w:ascii="Arial" w:hAnsi="Arial"/>
-          <w:sz w:val="24"/>
-        </w:rPr>
-        <w:t>Aspetta che Alessandro ti risponda. Lui sa cosa fare.</w:t>
+        <w:t>Quando Alessandro ti risponde, segui le sue istruzioni passo per passo. Se ti chiede di fare qualcosa che non capisci, chiedi spiegazioni prima di cliccare.</w:t>
       </w:r>
     </w:p>
     <w:p>
@@ -4732,7 +4522,7 @@
                 <w:rFonts w:ascii="Arial" w:hAnsi="Arial"/>
                 <w:sz w:val="22"/>
               </w:rPr>
-              <w:t>Il pannello admin salva automaticamente le ultime 5 versioni della tua bozza in IndexedDB (memoria del browser). Anche se non hai pubblicato, Alessandro può recuperarle dal tuo browser se serve. Quindi non perdere la calma anche se ti sembra di aver "perso" qualcosa.</w:t>
+              <w:t>Il pannello admin salva automaticamente le ultime 5 versioni della tua bozza in IndexedDB (memoria del browser). Anche se non hai pubblicato, Alessandro può recuperarle dal tuo browser. La cronologia GitHub conserva inoltre ogni modifica pubblicata negli ultimi mesi/anni. Niente è perso davvero.</w:t>
             </w:r>
           </w:p>
         </w:tc>
@@ -4753,7 +4543,7 @@
         <w:pStyle w:val="Heading1"/>
         <w:spacing w:before="240" w:after="160"/>
       </w:pPr>
-      <w:bookmarkStart w:id="21" w:name="_sec_6_faq_domande_frequenti"/>
+      <w:bookmarkStart w:id="19" w:name="_sec_6_faq_domande_frequenti"/>
       <w:r>
         <w:rPr>
           <w:rFonts w:ascii="Arial" w:hAnsi="Arial"/>
@@ -4762,7 +4552,7 @@
         </w:rPr>
         <w:t>6. FAQ — Domande frequenti</w:t>
       </w:r>
-      <w:bookmarkEnd w:id="21"/>
+      <w:bookmarkEnd w:id="19"/>
     </w:p>
     <w:p>
       <w:pPr>
@@ -5048,7 +4838,7 @@
           <w:rFonts w:ascii="Arial" w:hAnsi="Arial"/>
           <w:sz w:val="24"/>
         </w:rPr>
-        <w:t>Verifica nella cronologia GitHub se sono state fatte modifiche strane (vedi Sezione 5 per come accedervi). Se vedi commit che non sei stato tu a fare, segnalalo subito.</w:t>
+        <w:t>Chiedi ad Alessandro di verificare se sono state fatte modifiche strane. Lui ha tutti gli strumenti per controllarlo: tu non devi accedere a niente di tecnico.</w:t>
       </w:r>
     </w:p>
     <w:p>
@@ -5097,7 +4887,7 @@
           <w:rFonts w:ascii="Arial" w:hAnsi="Arial"/>
           <w:sz w:val="24"/>
         </w:rPr>
-        <w:t>NON aprire github.com per modificare file. (Solo per consultare la cronologia in caso di emergenza, vedi Sezione 5.)</w:t>
+        <w:t>NON aprire mai github.com. Tutte le operazioni si fanno dal pannello admin; se serve qualcosa di diverso, è un compito di Alessandro.</w:t>
       </w:r>
     </w:p>
     <w:p>
@@ -5183,7 +4973,7 @@
         <w:pStyle w:val="Heading1"/>
         <w:spacing w:before="240" w:after="160"/>
       </w:pPr>
-      <w:bookmarkStart w:id="22" w:name="_sec_contatti_rapidi"/>
+      <w:bookmarkStart w:id="20" w:name="_sec_contatti_rapidi"/>
       <w:r>
         <w:rPr>
           <w:rFonts w:ascii="Arial" w:hAnsi="Arial"/>
@@ -5192,7 +4982,7 @@
         </w:rPr>
         <w:t>Contatti rapidi</w:t>
       </w:r>
-      <w:bookmarkEnd w:id="22"/>
+      <w:bookmarkEnd w:id="20"/>
     </w:p>
     <w:p>
       <w:r>

</xml_diff>